<commit_message>
Proofread pass: fix repeated phrase, a table typo, a fragile cross-reference, and one inconsistency
- Abstract and conclusion both said 'no amount of X polish changes
  that' almost verbatim; reworded the conclusion's instance.
- Fixed a missing space in the roadmap table ('Phase 5:Continuous').
- Replaced a 'Table 2' cross-reference with a section reference, since
  Word's caption auto-numbering for that table wasn't confirmed.
- Added an Insufficient evidence row to the Appendix A rule-count table
  to match the Section 4.2 taxonomy table, which already had one.
</commit_message>
<xml_diff>
--- a/research/paper/FinGuard-AI A Rules-First, Explainable Framework for Narrative-Based Financial Fraud and Consumer-Harm Triage in U.S. Financial Services.docx
+++ b/research/paper/FinGuard-AI A Rules-First, Explainable Framework for Narrative-Based Financial Fraud and Consumer-Harm Triage in U.S. Financial Services.docx
@@ -4194,7 +4194,7 @@
     <w:p>
       <w:r>
         <w:rPr/>
-        <w:t>The portfolio view summarizes total cases, cases meeting the high-risk queue criterion, mean scores across all four dimensions, total reported loss, typology and payment-channel distribution, severity distribution, and high-risk case details, and it is clearly labeled as synthetic demonstration data rather than real consumer records. Users may download an analyzed CSV containing case inputs, classifications, scores, indicators, and recommendations, or upload their own CSV against the same schema for a private, in-memory analysis that is not stored. A companion public rule-explorer page lists every phrase rule with its identifier, weight, and rationale, so the classification logic in Table 2 is independently browsable rather than described only in this paper. This feature demonstrates how a narrative-level engine can support operational oversight in addition to single-case assistance.</w:t>
+        <w:t>The portfolio view summarizes total cases, cases meeting the high-risk queue criterion, mean scores across all four dimensions, total reported loss, typology and payment-channel distribution, severity distribution, and high-risk case details, and it is clearly labeled as synthetic demonstration data rather than real consumer records. Users may download an analyzed CSV containing case inputs, classifications, scores, indicators, and recommendations, or upload their own CSV against the same schema for a private, in-memory analysis that is not stored. A companion public rule-explorer page lists every phrase rule with its identifier, weight, and rationale, so the classification logic described in Section 4.2 is independently browsable rather than described only in this paper. This feature demonstrates how a narrative-level engine can support operational oversight in addition to single-case assistance.</w:t>
       </w:r>
     </w:p>
     <w:p>
@@ -7586,41 +7586,8 @@
             </w:tcMar>
           </w:tcPr>
           <w:p>
-            <w:pPr>
-              <w:spacing w:after="0"/>
-              <w:rPr>
-                <w:sz w:val="14"/>
-                <w:szCs w:val="14"/>
-              </w:rPr>
-            </w:pPr>
-            <w:r>
-              <w:rPr>
-                <w:b/>
-                <w:color w:val="123B55"/>
-                <w:sz w:val="14"/>
-                <w:szCs w:val="14"/>
-              </w:rPr>
-              <w:t xml:space="preserve">Phase </w:t>
-            </w:r>
-            <w:proofErr w:type="gramStart"/>
-            <w:r>
-              <w:rPr>
-                <w:b/>
-                <w:color w:val="123B55"/>
-                <w:sz w:val="14"/>
-                <w:szCs w:val="14"/>
-              </w:rPr>
-              <w:t>5:Continuous</w:t>
-            </w:r>
-            <w:proofErr w:type="gramEnd"/>
-            <w:r>
-              <w:rPr>
-                <w:b/>
-                <w:color w:val="123B55"/>
-                <w:sz w:val="14"/>
-                <w:szCs w:val="14"/>
-              </w:rPr>
-              <w:t xml:space="preserve"> governance</w:t>
+            <w:r>
+              <w:t>Phase 5: Continuous governance</w:t>
             </w:r>
           </w:p>
         </w:tc>
@@ -7686,7 +7653,7 @@
     <w:p>
       <w:r>
         <w:rPr/>
-        <w:t>Its contribution is more focused: it organizes narrative evidence into an auditable workflow that keeps fraud indicators, consumer harm, dispute friction, and recovery urgency distinct, and it now does so as a tested, publicly deployed platform rather than only a local script. The 30-case synthetic study confirms that the software functions across the intended categories and produces complete explanations, but it does not establish accuracy on real complaints, and no amount of engineering polish changes that. The next stage is therefore empirical rather than cosmetic: independently annotated public narratives, frozen rules, transparent baselines, robustness tests, and human-review studies. With those safeguards, FinGuard-AI can mature from a credible, reproducible research prototype into a well-evaluated contribution to financial-fraud intelligence and consumer-protection governance.</w:t>
+        <w:t>Its contribution is more focused: it organizes narrative evidence into an auditable workflow that keeps fraud indicators, consumer harm, dispute friction, and recovery urgency distinct, and it now does so as a tested, publicly deployed platform rather than only a local script. The 30-case synthetic study confirms that the software functions across the intended categories and produces complete explanations, but it does not establish accuracy on real complaints, and a stable deployment does not change that. The next stage is therefore empirical rather than cosmetic: independently annotated public narratives, frozen rules, transparent baselines, robustness tests, and human-review studies. With those safeguards, FinGuard-AI can mature from a credible, reproducible research prototype into a well-evaluated contribution to financial-fraud intelligence and consumer-protection governance.</w:t>
       </w:r>
     </w:p>
     <w:p>
@@ -9336,6 +9303,41 @@
                 <w:sz w:val="16"/>
               </w:rPr>
               <w:t>Fallback when no category-specific phrase is matched</w:t>
+            </w:r>
+          </w:p>
+        </w:tc>
+      </w:tr>
+      <w:tr>
+        <w:tc>
+          <w:tcPr>
+            <w:tcW w:type="dxa" w:w="3477"/>
+          </w:tcPr>
+          <w:p>
+            <w:r>
+              <w:rPr>
+                <w:b/>
+              </w:rPr>
+              <w:t>Insufficient evidence</w:t>
+            </w:r>
+          </w:p>
+        </w:tc>
+        <w:tc>
+          <w:tcPr>
+            <w:tcW w:type="dxa" w:w="1194"/>
+          </w:tcPr>
+          <w:p>
+            <w:r>
+              <w:t>0</w:t>
+            </w:r>
+          </w:p>
+        </w:tc>
+        <w:tc>
+          <w:tcPr>
+            <w:tcW w:type="dxa" w:w="5387"/>
+          </w:tcPr>
+          <w:p>
+            <w:r>
+              <w:t>Abstention state; triggered when no rule matches and the narrative is very short</w:t>
             </w:r>
           </w:p>
         </w:tc>

</xml_diff>